<commit_message>
Mismatch review timeout 2h -> 1h
Lunch break + a focused meeting fits well inside an hour; longer than
that and the run is almost certainly abandoned (analyst forgot the tab,
or stepped away for the day).  Re-uploading is cheap.  Tighter window
also means the registry slot frees sooner for the next run.
</commit_message>
<xml_diff>
--- a/docs/aic_v2_guide.docx
+++ b/docs/aic_v2_guide.docx
@@ -3223,7 +3223,7 @@
         <w:br/>
         <w:t>set_state(record, state='mismatch_pending')</w:t>
         <w:br/>
-        <w:t>record.resume_event.wait(timeout=2 * 60 * 60)</w:t>
+        <w:t>record.resume_event.wait(timeout=60 * 60)</w:t>
         <w:br/>
         <w:br/>
         <w:t># Analyst submits — POST /api/runs/{id}/mismatch/resolve</w:t>
@@ -3261,7 +3261,7 @@
         <w:pStyle w:val="ListBullet"/>
       </w:pPr>
       <w:r>
-        <w:t>Abandoned reviews self-heal. The 2-hour timeout on resume_event.wait() means a closed tab eventually marks the run as stopped, the worker exits, and the JobRecord becomes evictable by idle-TTL. No thread leak.</w:t>
+        <w:t>Abandoned reviews self-heal. The 1-hour timeout on resume_event.wait() means a closed tab eventually marks the run as stopped, the worker exits, and the JobRecord becomes evictable by idle-TTL. No thread leak.</w:t>
       </w:r>
     </w:p>
     <w:p>

</xml_diff>